<commit_message>
Update project reports, formatted script, and boxplot visualization
</commit_message>
<xml_diff>
--- a/Report/Mini_Project_Report_Arpit_Saxena.docx
+++ b/Report/Mini_Project_Report_Arpit_Saxena.docx
@@ -1567,7 +1567,9 @@
         <w:jc w:val="both"/>
         <w:rPr>
           <w:rFonts w:cs="Times New Roman"/>
-          <w:color w:val="000000" w:themeColor="text1"/>
+          <w:b/>
+          <w:color w:val="000000" w:themeColor="text1"/>
+          <w:lang w:val="en-IN"/>
         </w:rPr>
       </w:pPr>
       <w:r>
@@ -1575,7 +1577,37 @@
           <w:rFonts w:cs="Times New Roman"/>
           <w:color w:val="000000" w:themeColor="text1"/>
         </w:rPr>
-        <w:t>This is to certify that Arpit Saxena, student of Master of Computer Applications (MCA) – Data Science, Semester 1 (Roll No: 26MCD10006, Section: 26MCD-1 (A)), has successfully undertaken and completed the mini-project entitled “Statistical Analysis of E-Commerce Customer Spending Behavior Using R” as part of the Statistics with R course during the academic session 2026–2027 at Chandigarh University, Mohali.</w:t>
+        <w:t xml:space="preserve">This is to certify that Arpit Saxena, student of Master of Computer Applications (MCA) – Data Science, Semester 1 </w:t>
+      </w:r>
+      <w:r>
+        <w:rPr>
+          <w:rFonts w:cs="Times New Roman"/>
+          <w:color w:val="000000" w:themeColor="text1"/>
+        </w:rPr>
+        <w:t>UID</w:t>
+      </w:r>
+      <w:r>
+        <w:rPr>
+          <w:rFonts w:cs="Times New Roman"/>
+          <w:color w:val="000000" w:themeColor="text1"/>
+        </w:rPr>
+        <w:t>: 26MCD10006, Section: 26MCD-1 (A), has successfully undertaken and completed the mini-project entitled “</w:t>
+      </w:r>
+      <w:r>
+        <w:rPr>
+          <w:rFonts w:cs="Times New Roman"/>
+          <w:b/>
+          <w:color w:val="000000" w:themeColor="text1"/>
+          <w:lang w:val="en-IN"/>
+        </w:rPr>
+        <w:t>Application of R Programming in E-Commerce Customer Analytics</w:t>
+      </w:r>
+      <w:r>
+        <w:rPr>
+          <w:rFonts w:cs="Times New Roman"/>
+          <w:color w:val="000000" w:themeColor="text1"/>
+        </w:rPr>
+        <w:t>” as part of the Statistics with R course during the academic session 2026–2027 at Chandigarh University, Mohali.</w:t>
       </w:r>
       <w:r>
         <w:rPr>
@@ -1778,7 +1810,23 @@
           <w:rFonts w:cs="Times New Roman"/>
           <w:color w:val="000000" w:themeColor="text1"/>
         </w:rPr>
-        <w:t>I, Arpit Saxena, hereby declare that the mini-project report entitled “Statistical Analysis of E-Commerce Customer Spending Behavior Using R” is my original academic work, carried out as part of the Master of Computer Applications (MCA) – Data Science, 1st Semester programme at Chandigarh University, Mohali.</w:t>
+        <w:t>I, Arpit Saxena, hereby declare that the mini-project report entitled “</w:t>
+      </w:r>
+      <w:r>
+        <w:rPr>
+          <w:rFonts w:cs="Times New Roman"/>
+          <w:b/>
+          <w:color w:val="000000" w:themeColor="text1"/>
+          <w:lang w:val="en-IN"/>
+        </w:rPr>
+        <w:t>Application of R Programming in E-Commerce Customer Analytics</w:t>
+      </w:r>
+      <w:r>
+        <w:rPr>
+          <w:rFonts w:cs="Times New Roman"/>
+          <w:color w:val="000000" w:themeColor="text1"/>
+        </w:rPr>
+        <w:t>” is my original academic work, carried out as part of the Master of Computer Applications (MCA) – Data Science, 1st Semester programme at Chandigarh University, Mohali.</w:t>
       </w:r>
     </w:p>
     <w:p>
@@ -1962,7 +2010,23 @@
           <w:rFonts w:cs="Times New Roman"/>
           <w:color w:val="000000" w:themeColor="text1"/>
         </w:rPr>
-        <w:t>), for her invaluable guidance, continuous encouragement, and critical feedback throughout the development of this mini-project, “Statistical Analysis of E-Commerce Customer Spending Behavior Using R.” Her instructional clarity helped me master the practical application of R programming, hypothesis testing, linear modeling, and exploratory data visualization.</w:t>
+        <w:t>), for her invaluable guidance, continuous encouragement, and critical feedback throughout the development of this mini-project, “</w:t>
+      </w:r>
+      <w:r>
+        <w:rPr>
+          <w:rFonts w:cs="Times New Roman"/>
+          <w:b/>
+          <w:color w:val="000000" w:themeColor="text1"/>
+          <w:lang w:val="en-IN"/>
+        </w:rPr>
+        <w:t>Application of R Programming in E-Commerce Customer Analytics</w:t>
+      </w:r>
+      <w:r>
+        <w:rPr>
+          <w:rFonts w:cs="Times New Roman"/>
+          <w:color w:val="000000" w:themeColor="text1"/>
+        </w:rPr>
+        <w:t>.” Her instructional clarity helped me master the practical application of R programming, hypothesis testing, linear modeling, and exploratory data visualization.</w:t>
       </w:r>
       <w:r>
         <w:rPr>
@@ -8574,7 +8638,6 @@
   <w:style w:type="character" w:default="1" w:styleId="DefaultParagraphFont">
     <w:name w:val="Default Paragraph Font"/>
     <w:uiPriority w:val="1"/>
-    <w:semiHidden/>
     <w:unhideWhenUsed/>
   </w:style>
   <w:style w:type="table" w:default="1" w:styleId="TableNormal">

</xml_diff>